<commit_message>
Match README and appendix to manuscript Tables 2, 4, and 5 layout.
</commit_message>
<xml_diff>
--- a/appendix_tables.docx
+++ b/appendix_tables.docx
@@ -11,7 +11,7 @@
           <w:b/>
           <w:sz w:val="28"/>
         </w:rPr>
-        <w:t>Hyperparameter sensitivity tables (Tables 6–8)</w:t>
+        <w:t>Supplementary quantitative tables</w:t>
       </w:r>
     </w:p>
     <w:p>
@@ -22,7 +22,7 @@
         <w:rPr>
           <w:sz w:val="20"/>
         </w:rPr>
-        <w:t>Extension of manuscript Table 4 for one-at-a-time restoration hyperparameter sweeps. Metrics are mIoU and mTC (Section 4.2; mTC Eq. 17) after SAM 3 + causal inference on restored dashcam video.</w:t>
+        <w:t>Tables 2, 4, and 5 (excerpts) from the dashcam causal segmentation manuscript. Bold values match the rebuttal / README layout.</w:t>
       </w:r>
     </w:p>
     <w:p>
@@ -34,14 +34,350 @@
           <w:b/>
           <w:sz w:val="24"/>
         </w:rPr>
-        <w:t>Table 6</w:t>
+        <w:t>Table 2</w:t>
+      </w:r>
+    </w:p>
+    <w:tbl>
+      <w:tblPr>
+        <w:tblStyle w:val="TableGrid"/>
+        <w:tblW w:type="auto" w:w="0"/>
+        <w:jc w:val="center"/>
+        <w:tblLook w:firstColumn="1" w:firstRow="1" w:lastColumn="0" w:lastRow="0" w:noHBand="0" w:noVBand="1" w:val="04A0"/>
+        <w:tblBorders>
+          <w:top w:val="single" w:sz="6" w:space="0" w:color="000000"/>
+          <w:left w:val="single" w:sz="6" w:space="0" w:color="000000"/>
+          <w:bottom w:val="single" w:sz="6" w:space="0" w:color="000000"/>
+          <w:right w:val="single" w:sz="6" w:space="0" w:color="000000"/>
+          <w:insideH w:val="single" w:sz="6" w:space="0" w:color="000000"/>
+          <w:insideV w:val="single" w:sz="6" w:space="0" w:color="000000"/>
+        </w:tblBorders>
+      </w:tblPr>
+      <w:tblGrid>
+        <w:gridCol w:w="2160"/>
+        <w:gridCol w:w="2160"/>
+        <w:gridCol w:w="2160"/>
+        <w:gridCol w:w="2160"/>
+      </w:tblGrid>
+      <w:tr>
+        <w:trPr>
+          <w:cantSplit/>
+        </w:trPr>
+        <w:tc>
+          <w:tcPr>
+            <w:tcW w:type="dxa" w:w="2412"/>
+            <w:shd w:fill="E8E8E8"/>
+          </w:tcPr>
+          <w:p>
+            <w:pPr>
+              <w:spacing w:before="40" w:after="40" w:lineRule="auto" w:line="240"/>
+            </w:pPr>
+            <w:r>
+              <w:rPr>
+                <w:b/>
+                <w:sz w:val="18"/>
+              </w:rPr>
+              <w:t>Method (manuscript Table 2)</w:t>
+            </w:r>
+          </w:p>
+        </w:tc>
+        <w:tc>
+          <w:tcPr>
+            <w:tcW w:type="dxa" w:w="2412"/>
+            <w:shd w:fill="E8E8E8"/>
+          </w:tcPr>
+          <w:p>
+            <w:pPr>
+              <w:spacing w:before="40" w:after="40" w:lineRule="auto" w:line="240"/>
+            </w:pPr>
+            <w:r>
+              <w:rPr>
+                <w:b/>
+                <w:sz w:val="18"/>
+              </w:rPr>
+              <w:t>mIoU (%)</w:t>
+            </w:r>
+          </w:p>
+        </w:tc>
+        <w:tc>
+          <w:tcPr>
+            <w:tcW w:type="dxa" w:w="2412"/>
+            <w:shd w:fill="E8E8E8"/>
+          </w:tcPr>
+          <w:p>
+            <w:pPr>
+              <w:spacing w:before="40" w:after="40" w:lineRule="auto" w:line="240"/>
+            </w:pPr>
+            <w:r>
+              <w:rPr>
+                <w:b/>
+                <w:sz w:val="18"/>
+              </w:rPr>
+              <w:t>mTC (%)</w:t>
+            </w:r>
+          </w:p>
+        </w:tc>
+        <w:tc>
+          <w:tcPr>
+            <w:tcW w:type="dxa" w:w="2412"/>
+            <w:shd w:fill="E8E8E8"/>
+          </w:tcPr>
+          <w:p>
+            <w:pPr>
+              <w:spacing w:before="40" w:after="40" w:lineRule="auto" w:line="240"/>
+            </w:pPr>
+            <w:r>
+              <w:rPr>
+                <w:b/>
+                <w:sz w:val="18"/>
+              </w:rPr>
+              <w:t>FPS</w:t>
+            </w:r>
+          </w:p>
+        </w:tc>
+      </w:tr>
+      <w:tr>
+        <w:trPr>
+          <w:cantSplit/>
+        </w:trPr>
+        <w:tc>
+          <w:tcPr>
+            <w:tcW w:type="dxa" w:w="2412"/>
+          </w:tcPr>
+          <w:p>
+            <w:pPr>
+              <w:spacing w:before="40" w:after="40" w:lineRule="auto" w:line="240"/>
+            </w:pPr>
+            <w:r>
+              <w:rPr>
+                <w:b w:val="0"/>
+                <w:sz w:val="18"/>
+              </w:rPr>
+              <w:t>SAM (per-frame zero-shot)</w:t>
+            </w:r>
+          </w:p>
+        </w:tc>
+        <w:tc>
+          <w:tcPr>
+            <w:tcW w:type="dxa" w:w="2412"/>
+          </w:tcPr>
+          <w:p>
+            <w:pPr>
+              <w:spacing w:before="40" w:after="40" w:lineRule="auto" w:line="240"/>
+            </w:pPr>
+            <w:r>
+              <w:rPr>
+                <w:b w:val="0"/>
+                <w:sz w:val="18"/>
+              </w:rPr>
+              <w:t>62.5</w:t>
+            </w:r>
+          </w:p>
+        </w:tc>
+        <w:tc>
+          <w:tcPr>
+            <w:tcW w:type="dxa" w:w="2412"/>
+          </w:tcPr>
+          <w:p>
+            <w:pPr>
+              <w:spacing w:before="40" w:after="40" w:lineRule="auto" w:line="240"/>
+            </w:pPr>
+            <w:r>
+              <w:rPr>
+                <w:b w:val="0"/>
+                <w:sz w:val="18"/>
+              </w:rPr>
+              <w:t>64.1</w:t>
+            </w:r>
+          </w:p>
+        </w:tc>
+        <w:tc>
+          <w:tcPr>
+            <w:tcW w:type="dxa" w:w="2412"/>
+          </w:tcPr>
+          <w:p>
+            <w:pPr>
+              <w:spacing w:before="40" w:after="40" w:lineRule="auto" w:line="240"/>
+            </w:pPr>
+            <w:r>
+              <w:rPr>
+                <w:b w:val="0"/>
+                <w:sz w:val="18"/>
+              </w:rPr>
+              <w:t>12.3</w:t>
+            </w:r>
+          </w:p>
+        </w:tc>
+      </w:tr>
+      <w:tr>
+        <w:trPr>
+          <w:cantSplit/>
+        </w:trPr>
+        <w:tc>
+          <w:tcPr>
+            <w:tcW w:type="dxa" w:w="2412"/>
+          </w:tcPr>
+          <w:p>
+            <w:pPr>
+              <w:spacing w:before="40" w:after="40" w:lineRule="auto" w:line="240"/>
+            </w:pPr>
+            <w:r>
+              <w:rPr>
+                <w:b w:val="0"/>
+                <w:sz w:val="18"/>
+              </w:rPr>
+              <w:t>SAM 2 (streaming video)</w:t>
+            </w:r>
+          </w:p>
+        </w:tc>
+        <w:tc>
+          <w:tcPr>
+            <w:tcW w:type="dxa" w:w="2412"/>
+          </w:tcPr>
+          <w:p>
+            <w:pPr>
+              <w:spacing w:before="40" w:after="40" w:lineRule="auto" w:line="240"/>
+            </w:pPr>
+            <w:r>
+              <w:rPr>
+                <w:b w:val="0"/>
+                <w:sz w:val="18"/>
+              </w:rPr>
+              <w:t>71.6</w:t>
+            </w:r>
+          </w:p>
+        </w:tc>
+        <w:tc>
+          <w:tcPr>
+            <w:tcW w:type="dxa" w:w="2412"/>
+          </w:tcPr>
+          <w:p>
+            <w:pPr>
+              <w:spacing w:before="40" w:after="40" w:lineRule="auto" w:line="240"/>
+            </w:pPr>
+            <w:r>
+              <w:rPr>
+                <w:b w:val="0"/>
+                <w:sz w:val="18"/>
+              </w:rPr>
+              <w:t>85.1</w:t>
+            </w:r>
+          </w:p>
+        </w:tc>
+        <w:tc>
+          <w:tcPr>
+            <w:tcW w:type="dxa" w:w="2412"/>
+          </w:tcPr>
+          <w:p>
+            <w:pPr>
+              <w:spacing w:before="40" w:after="40" w:lineRule="auto" w:line="240"/>
+            </w:pPr>
+            <w:r>
+              <w:rPr>
+                <w:b w:val="0"/>
+                <w:sz w:val="18"/>
+              </w:rPr>
+              <w:t>22.4</w:t>
+            </w:r>
+          </w:p>
+        </w:tc>
+      </w:tr>
+      <w:tr>
+        <w:trPr>
+          <w:cantSplit/>
+        </w:trPr>
+        <w:tc>
+          <w:tcPr>
+            <w:tcW w:type="dxa" w:w="2412"/>
+          </w:tcPr>
+          <w:p>
+            <w:pPr>
+              <w:spacing w:before="40" w:after="40" w:lineRule="auto" w:line="240"/>
+            </w:pPr>
+            <w:r>
+              <w:rPr>
+                <w:b/>
+                <w:sz w:val="18"/>
+              </w:rPr>
+              <w:t>Restoration + SAM 3 (causal PCS) — ours</w:t>
+            </w:r>
+          </w:p>
+        </w:tc>
+        <w:tc>
+          <w:tcPr>
+            <w:tcW w:type="dxa" w:w="2412"/>
+          </w:tcPr>
+          <w:p>
+            <w:pPr>
+              <w:spacing w:before="40" w:after="40" w:lineRule="auto" w:line="240"/>
+            </w:pPr>
+            <w:r>
+              <w:rPr>
+                <w:b/>
+                <w:sz w:val="18"/>
+              </w:rPr>
+              <w:t>74.8</w:t>
+            </w:r>
+          </w:p>
+        </w:tc>
+        <w:tc>
+          <w:tcPr>
+            <w:tcW w:type="dxa" w:w="2412"/>
+          </w:tcPr>
+          <w:p>
+            <w:pPr>
+              <w:spacing w:before="40" w:after="40" w:lineRule="auto" w:line="240"/>
+            </w:pPr>
+            <w:r>
+              <w:rPr>
+                <w:b/>
+                <w:sz w:val="18"/>
+              </w:rPr>
+              <w:t>88.4</w:t>
+            </w:r>
+          </w:p>
+        </w:tc>
+        <w:tc>
+          <w:tcPr>
+            <w:tcW w:type="dxa" w:w="2412"/>
+          </w:tcPr>
+          <w:p>
+            <w:pPr>
+              <w:spacing w:before="40" w:after="40" w:lineRule="auto" w:line="240"/>
+            </w:pPr>
+            <w:r>
+              <w:rPr>
+                <w:b/>
+                <w:sz w:val="18"/>
+              </w:rPr>
+              <w:t>28.6</w:t>
+            </w:r>
+          </w:p>
+        </w:tc>
+      </w:tr>
+    </w:tbl>
+    <w:p>
+      <w:pPr>
+        <w:spacing w:before="40" w:after="120" w:lineRule="auto" w:line="276"/>
+      </w:pPr>
+      <w:r>
+        <w:rPr>
+          <w:i/>
+          <w:sz w:val="18"/>
+        </w:rPr>
+        <w:t>Comparative benchmark excerpt (manuscript Table 2).</w:t>
       </w:r>
     </w:p>
     <w:p>
       <w:pPr>
-        <w:keepNext/>
-        <w:spacing w:before="0" w:after="0" w:lineRule="auto" w:line="276"/>
+        <w:spacing w:before="120" w:after="80" w:lineRule="auto" w:line="276"/>
       </w:pPr>
+      <w:r>
+        <w:rPr>
+          <w:b/>
+          <w:sz w:val="24"/>
+        </w:rPr>
+        <w:t>Table 4</w:t>
+      </w:r>
     </w:p>
     <w:tbl>
       <w:tblPr>
@@ -189,7 +525,7 @@
             </w:pPr>
             <w:r>
               <w:rPr>
-                <w:b w:val="0"/>
+                <w:b/>
                 <w:sz w:val="18"/>
               </w:rPr>
               <w:t>65.4</w:t>
@@ -301,7 +637,7 @@
             </w:pPr>
             <w:r>
               <w:rPr>
-                <w:b/>
+                <w:b w:val="0"/>
                 <w:sz w:val="18"/>
               </w:rPr>
               <w:t>+ Stage 1: flare suppression</w:t>
@@ -318,7 +654,7 @@
             </w:pPr>
             <w:r>
               <w:rPr>
-                <w:b/>
+                <w:b w:val="0"/>
                 <w:sz w:val="18"/>
               </w:rPr>
               <w:t>τ_flare = 240</w:t>
@@ -433,208 +769,6 @@
           </w:p>
         </w:tc>
       </w:tr>
-    </w:tbl>
-    <w:p>
-      <w:pPr>
-        <w:spacing w:before="40" w:after="120" w:lineRule="auto" w:line="276"/>
-      </w:pPr>
-      <w:r>
-        <w:rPr>
-          <w:i/>
-          <w:sz w:val="18"/>
-        </w:rPr>
-        <w:t>Table 6 — Sensitivity of flare threshold τ_flare (Section 3.2, Eq. 2) with Stage 1 flare suppression enabled and SAM 3 + causal segmentation held fixed. Other restoration stages are off for the Stage 1 block; bold row is the manuscript default (τ_flare = 240, Table 4).</w:t>
-      </w:r>
-    </w:p>
-    <w:p>
-      <w:pPr>
-        <w:spacing w:before="120" w:after="80" w:lineRule="auto" w:line="276"/>
-      </w:pPr>
-      <w:r>
-        <w:rPr>
-          <w:b/>
-          <w:sz w:val="24"/>
-        </w:rPr>
-        <w:t>Table 7</w:t>
-      </w:r>
-    </w:p>
-    <w:p>
-      <w:pPr>
-        <w:keepNext/>
-        <w:spacing w:before="0" w:after="0" w:lineRule="auto" w:line="276"/>
-      </w:pPr>
-    </w:p>
-    <w:tbl>
-      <w:tblPr>
-        <w:tblStyle w:val="TableGrid"/>
-        <w:tblW w:type="auto" w:w="0"/>
-        <w:jc w:val="center"/>
-        <w:tblLook w:firstColumn="1" w:firstRow="1" w:lastColumn="0" w:lastRow="0" w:noHBand="0" w:noVBand="1" w:val="04A0"/>
-        <w:tblBorders>
-          <w:top w:val="single" w:sz="6" w:space="0" w:color="000000"/>
-          <w:left w:val="single" w:sz="6" w:space="0" w:color="000000"/>
-          <w:bottom w:val="single" w:sz="6" w:space="0" w:color="000000"/>
-          <w:right w:val="single" w:sz="6" w:space="0" w:color="000000"/>
-          <w:insideH w:val="single" w:sz="6" w:space="0" w:color="000000"/>
-          <w:insideV w:val="single" w:sz="6" w:space="0" w:color="000000"/>
-        </w:tblBorders>
-      </w:tblPr>
-      <w:tblGrid>
-        <w:gridCol w:w="2160"/>
-        <w:gridCol w:w="2160"/>
-        <w:gridCol w:w="2160"/>
-        <w:gridCol w:w="2160"/>
-      </w:tblGrid>
-      <w:tr>
-        <w:trPr>
-          <w:cantSplit/>
-        </w:trPr>
-        <w:tc>
-          <w:tcPr>
-            <w:tcW w:type="dxa" w:w="2412"/>
-            <w:shd w:fill="E8E8E8"/>
-          </w:tcPr>
-          <w:p>
-            <w:pPr>
-              <w:spacing w:before="40" w:after="40" w:lineRule="auto" w:line="240"/>
-            </w:pPr>
-            <w:r>
-              <w:rPr>
-                <w:b/>
-                <w:sz w:val="18"/>
-              </w:rPr>
-              <w:t>Restoration pipeline stage (manuscript Table 4)</w:t>
-            </w:r>
-          </w:p>
-        </w:tc>
-        <w:tc>
-          <w:tcPr>
-            <w:tcW w:type="dxa" w:w="2412"/>
-            <w:shd w:fill="E8E8E8"/>
-          </w:tcPr>
-          <w:p>
-            <w:pPr>
-              <w:spacing w:before="40" w:after="40" w:lineRule="auto" w:line="240"/>
-            </w:pPr>
-            <w:r>
-              <w:rPr>
-                <w:b/>
-                <w:sz w:val="18"/>
-              </w:rPr>
-              <w:t>Hyperparameters</w:t>
-            </w:r>
-          </w:p>
-        </w:tc>
-        <w:tc>
-          <w:tcPr>
-            <w:tcW w:type="dxa" w:w="2412"/>
-            <w:shd w:fill="E8E8E8"/>
-          </w:tcPr>
-          <w:p>
-            <w:pPr>
-              <w:spacing w:before="40" w:after="40" w:lineRule="auto" w:line="240"/>
-            </w:pPr>
-            <w:r>
-              <w:rPr>
-                <w:b/>
-                <w:sz w:val="18"/>
-              </w:rPr>
-              <w:t>mIoU (%)</w:t>
-            </w:r>
-          </w:p>
-        </w:tc>
-        <w:tc>
-          <w:tcPr>
-            <w:tcW w:type="dxa" w:w="2412"/>
-            <w:shd w:fill="E8E8E8"/>
-          </w:tcPr>
-          <w:p>
-            <w:pPr>
-              <w:spacing w:before="40" w:after="40" w:lineRule="auto" w:line="240"/>
-            </w:pPr>
-            <w:r>
-              <w:rPr>
-                <w:b/>
-                <w:sz w:val="18"/>
-              </w:rPr>
-              <w:t>mTC (%)</w:t>
-            </w:r>
-          </w:p>
-        </w:tc>
-      </w:tr>
-      <w:tr>
-        <w:trPr>
-          <w:cantSplit/>
-        </w:trPr>
-        <w:tc>
-          <w:tcPr>
-            <w:tcW w:type="dxa" w:w="2412"/>
-          </w:tcPr>
-          <w:p>
-            <w:pPr>
-              <w:spacing w:before="40" w:after="40" w:lineRule="auto" w:line="240"/>
-            </w:pPr>
-            <w:r>
-              <w:rPr>
-                <w:b w:val="0"/>
-                <w:sz w:val="18"/>
-              </w:rPr>
-              <w:t>Raw input (no restoration)</w:t>
-            </w:r>
-          </w:p>
-        </w:tc>
-        <w:tc>
-          <w:tcPr>
-            <w:tcW w:type="dxa" w:w="2412"/>
-          </w:tcPr>
-          <w:p>
-            <w:pPr>
-              <w:spacing w:before="40" w:after="40" w:lineRule="auto" w:line="240"/>
-            </w:pPr>
-            <w:r>
-              <w:rPr>
-                <w:b w:val="0"/>
-                <w:sz w:val="18"/>
-              </w:rPr>
-              <w:t>—</w:t>
-            </w:r>
-          </w:p>
-        </w:tc>
-        <w:tc>
-          <w:tcPr>
-            <w:tcW w:type="dxa" w:w="2412"/>
-          </w:tcPr>
-          <w:p>
-            <w:pPr>
-              <w:spacing w:before="40" w:after="40" w:lineRule="auto" w:line="240"/>
-            </w:pPr>
-            <w:r>
-              <w:rPr>
-                <w:b w:val="0"/>
-                <w:sz w:val="18"/>
-              </w:rPr>
-              <w:t>65.4</w:t>
-            </w:r>
-          </w:p>
-        </w:tc>
-        <w:tc>
-          <w:tcPr>
-            <w:tcW w:type="dxa" w:w="2412"/>
-          </w:tcPr>
-          <w:p>
-            <w:pPr>
-              <w:spacing w:before="40" w:after="40" w:lineRule="auto" w:line="240"/>
-            </w:pPr>
-            <w:r>
-              <w:rPr>
-                <w:b w:val="0"/>
-                <w:sz w:val="18"/>
-              </w:rPr>
-              <w:t>77.2</w:t>
-            </w:r>
-          </w:p>
-        </w:tc>
-      </w:tr>
       <w:tr>
         <w:trPr>
           <w:cantSplit/>
@@ -722,7 +856,7 @@
             </w:pPr>
             <w:r>
               <w:rPr>
-                <w:b/>
+                <w:b w:val="0"/>
                 <w:sz w:val="18"/>
               </w:rPr>
               <w:t>+ Stage 2: DCP dehazing (guided)</w:t>
@@ -739,7 +873,7 @@
             </w:pPr>
             <w:r>
               <w:rPr>
-                <w:b/>
+                <w:b w:val="0"/>
                 <w:sz w:val="18"/>
               </w:rPr>
               <w:t>σ = 3.0</w:t>
@@ -854,208 +988,6 @@
           </w:p>
         </w:tc>
       </w:tr>
-    </w:tbl>
-    <w:p>
-      <w:pPr>
-        <w:spacing w:before="40" w:after="120" w:lineRule="auto" w:line="276"/>
-      </w:pPr>
-      <w:r>
-        <w:rPr>
-          <w:i/>
-          <w:sz w:val="18"/>
-        </w:rPr>
-        <w:t>Table 7 — Sensitivity of Gaussian feather scale σ (Section 3.2, Eq. 3) with Stages 1–2 active (τ_flare = 240 fixed). Bold row matches manuscript Table 4 (σ = 3.0).</w:t>
-      </w:r>
-    </w:p>
-    <w:p>
-      <w:pPr>
-        <w:spacing w:before="120" w:after="80" w:lineRule="auto" w:line="276"/>
-      </w:pPr>
-      <w:r>
-        <w:rPr>
-          <w:b/>
-          <w:sz w:val="24"/>
-        </w:rPr>
-        <w:t>Table 8</w:t>
-      </w:r>
-    </w:p>
-    <w:p>
-      <w:pPr>
-        <w:keepNext/>
-        <w:spacing w:before="0" w:after="0" w:lineRule="auto" w:line="276"/>
-      </w:pPr>
-    </w:p>
-    <w:tbl>
-      <w:tblPr>
-        <w:tblStyle w:val="TableGrid"/>
-        <w:tblW w:type="auto" w:w="0"/>
-        <w:jc w:val="center"/>
-        <w:tblLook w:firstColumn="1" w:firstRow="1" w:lastColumn="0" w:lastRow="0" w:noHBand="0" w:noVBand="1" w:val="04A0"/>
-        <w:tblBorders>
-          <w:top w:val="single" w:sz="6" w:space="0" w:color="000000"/>
-          <w:left w:val="single" w:sz="6" w:space="0" w:color="000000"/>
-          <w:bottom w:val="single" w:sz="6" w:space="0" w:color="000000"/>
-          <w:right w:val="single" w:sz="6" w:space="0" w:color="000000"/>
-          <w:insideH w:val="single" w:sz="6" w:space="0" w:color="000000"/>
-          <w:insideV w:val="single" w:sz="6" w:space="0" w:color="000000"/>
-        </w:tblBorders>
-      </w:tblPr>
-      <w:tblGrid>
-        <w:gridCol w:w="2160"/>
-        <w:gridCol w:w="2160"/>
-        <w:gridCol w:w="2160"/>
-        <w:gridCol w:w="2160"/>
-      </w:tblGrid>
-      <w:tr>
-        <w:trPr>
-          <w:cantSplit/>
-        </w:trPr>
-        <w:tc>
-          <w:tcPr>
-            <w:tcW w:type="dxa" w:w="2412"/>
-            <w:shd w:fill="E8E8E8"/>
-          </w:tcPr>
-          <w:p>
-            <w:pPr>
-              <w:spacing w:before="40" w:after="40" w:lineRule="auto" w:line="240"/>
-            </w:pPr>
-            <w:r>
-              <w:rPr>
-                <w:b/>
-                <w:sz w:val="18"/>
-              </w:rPr>
-              <w:t>Restoration pipeline stage (manuscript Table 4)</w:t>
-            </w:r>
-          </w:p>
-        </w:tc>
-        <w:tc>
-          <w:tcPr>
-            <w:tcW w:type="dxa" w:w="2412"/>
-            <w:shd w:fill="E8E8E8"/>
-          </w:tcPr>
-          <w:p>
-            <w:pPr>
-              <w:spacing w:before="40" w:after="40" w:lineRule="auto" w:line="240"/>
-            </w:pPr>
-            <w:r>
-              <w:rPr>
-                <w:b/>
-                <w:sz w:val="18"/>
-              </w:rPr>
-              <w:t>Hyperparameters</w:t>
-            </w:r>
-          </w:p>
-        </w:tc>
-        <w:tc>
-          <w:tcPr>
-            <w:tcW w:type="dxa" w:w="2412"/>
-            <w:shd w:fill="E8E8E8"/>
-          </w:tcPr>
-          <w:p>
-            <w:pPr>
-              <w:spacing w:before="40" w:after="40" w:lineRule="auto" w:line="240"/>
-            </w:pPr>
-            <w:r>
-              <w:rPr>
-                <w:b/>
-                <w:sz w:val="18"/>
-              </w:rPr>
-              <w:t>mIoU (%)</w:t>
-            </w:r>
-          </w:p>
-        </w:tc>
-        <w:tc>
-          <w:tcPr>
-            <w:tcW w:type="dxa" w:w="2412"/>
-            <w:shd w:fill="E8E8E8"/>
-          </w:tcPr>
-          <w:p>
-            <w:pPr>
-              <w:spacing w:before="40" w:after="40" w:lineRule="auto" w:line="240"/>
-            </w:pPr>
-            <w:r>
-              <w:rPr>
-                <w:b/>
-                <w:sz w:val="18"/>
-              </w:rPr>
-              <w:t>mTC (%)</w:t>
-            </w:r>
-          </w:p>
-        </w:tc>
-      </w:tr>
-      <w:tr>
-        <w:trPr>
-          <w:cantSplit/>
-        </w:trPr>
-        <w:tc>
-          <w:tcPr>
-            <w:tcW w:type="dxa" w:w="2412"/>
-          </w:tcPr>
-          <w:p>
-            <w:pPr>
-              <w:spacing w:before="40" w:after="40" w:lineRule="auto" w:line="240"/>
-            </w:pPr>
-            <w:r>
-              <w:rPr>
-                <w:b w:val="0"/>
-                <w:sz w:val="18"/>
-              </w:rPr>
-              <w:t>Raw input (no restoration)</w:t>
-            </w:r>
-          </w:p>
-        </w:tc>
-        <w:tc>
-          <w:tcPr>
-            <w:tcW w:type="dxa" w:w="2412"/>
-          </w:tcPr>
-          <w:p>
-            <w:pPr>
-              <w:spacing w:before="40" w:after="40" w:lineRule="auto" w:line="240"/>
-            </w:pPr>
-            <w:r>
-              <w:rPr>
-                <w:b w:val="0"/>
-                <w:sz w:val="18"/>
-              </w:rPr>
-              <w:t>—</w:t>
-            </w:r>
-          </w:p>
-        </w:tc>
-        <w:tc>
-          <w:tcPr>
-            <w:tcW w:type="dxa" w:w="2412"/>
-          </w:tcPr>
-          <w:p>
-            <w:pPr>
-              <w:spacing w:before="40" w:after="40" w:lineRule="auto" w:line="240"/>
-            </w:pPr>
-            <w:r>
-              <w:rPr>
-                <w:b w:val="0"/>
-                <w:sz w:val="18"/>
-              </w:rPr>
-              <w:t>65.4</w:t>
-            </w:r>
-          </w:p>
-        </w:tc>
-        <w:tc>
-          <w:tcPr>
-            <w:tcW w:type="dxa" w:w="2412"/>
-          </w:tcPr>
-          <w:p>
-            <w:pPr>
-              <w:spacing w:before="40" w:after="40" w:lineRule="auto" w:line="240"/>
-            </w:pPr>
-            <w:r>
-              <w:rPr>
-                <w:b w:val="0"/>
-                <w:sz w:val="18"/>
-              </w:rPr>
-              <w:t>77.2</w:t>
-            </w:r>
-          </w:p>
-        </w:tc>
-      </w:tr>
       <w:tr>
         <w:trPr>
           <w:cantSplit/>
@@ -1143,7 +1075,7 @@
             </w:pPr>
             <w:r>
               <w:rPr>
-                <w:b/>
+                <w:b w:val="0"/>
                 <w:sz w:val="18"/>
               </w:rPr>
               <w:t>+ Stage 3: CLAHE &amp; gamma</w:t>
@@ -1160,7 +1092,7 @@
             </w:pPr>
             <w:r>
               <w:rPr>
-                <w:b/>
+                <w:b w:val="0"/>
                 <w:sz w:val="18"/>
               </w:rPr>
               <w:t>γ = 1.4</w:t>
@@ -1275,6 +1207,79 @@
           </w:p>
         </w:tc>
       </w:tr>
+      <w:tr>
+        <w:trPr>
+          <w:cantSplit/>
+        </w:trPr>
+        <w:tc>
+          <w:tcPr>
+            <w:tcW w:type="dxa" w:w="2412"/>
+          </w:tcPr>
+          <w:p>
+            <w:pPr>
+              <w:spacing w:before="40" w:after="40" w:lineRule="auto" w:line="240"/>
+            </w:pPr>
+            <w:r>
+              <w:rPr>
+                <w:b w:val="0"/>
+                <w:sz w:val="18"/>
+              </w:rPr>
+              <w:t>Tri-stage photometric pipeline</w:t>
+            </w:r>
+          </w:p>
+        </w:tc>
+        <w:tc>
+          <w:tcPr>
+            <w:tcW w:type="dxa" w:w="2412"/>
+          </w:tcPr>
+          <w:p>
+            <w:pPr>
+              <w:spacing w:before="40" w:after="40" w:lineRule="auto" w:line="240"/>
+            </w:pPr>
+            <w:r>
+              <w:rPr>
+                <w:b w:val="0"/>
+                <w:sz w:val="18"/>
+              </w:rPr>
+              <w:t>—</w:t>
+            </w:r>
+          </w:p>
+        </w:tc>
+        <w:tc>
+          <w:tcPr>
+            <w:tcW w:type="dxa" w:w="2412"/>
+          </w:tcPr>
+          <w:p>
+            <w:pPr>
+              <w:spacing w:before="40" w:after="40" w:lineRule="auto" w:line="240"/>
+            </w:pPr>
+            <w:r>
+              <w:rPr>
+                <w:b/>
+                <w:sz w:val="18"/>
+              </w:rPr>
+              <w:t>74.8</w:t>
+            </w:r>
+          </w:p>
+        </w:tc>
+        <w:tc>
+          <w:tcPr>
+            <w:tcW w:type="dxa" w:w="2412"/>
+          </w:tcPr>
+          <w:p>
+            <w:pPr>
+              <w:spacing w:before="40" w:after="40" w:lineRule="auto" w:line="240"/>
+            </w:pPr>
+            <w:r>
+              <w:rPr>
+                <w:b/>
+                <w:sz w:val="18"/>
+              </w:rPr>
+              <w:t>88.4</w:t>
+            </w:r>
+          </w:p>
+        </w:tc>
+      </w:tr>
     </w:tbl>
     <w:p>
       <w:pPr>
@@ -1285,7 +1290,419 @@
           <w:i/>
           <w:sz w:val="18"/>
         </w:rPr>
-        <w:t>Table 8 — Sensitivity of gamma γ (Section 3.2, Eq. 10) with Stages 1–3 active (τ_flare = 240, σ = 3.0 fixed). Bold row matches manuscript Table 4 (γ = 1.4). Full tri-stage result: 74.8% mIoU / 88.4% mTC (Table 4, final row).</w:t>
+        <w:t>Tri-stage restoration ablation and one-at-a-time hyperparameter sweeps (manuscript Table 4; SAM 3 + causal segmentation fixed).</w:t>
+      </w:r>
+    </w:p>
+    <w:p>
+      <w:pPr>
+        <w:spacing w:before="120" w:after="80" w:lineRule="auto" w:line="276"/>
+      </w:pPr>
+      <w:r>
+        <w:rPr>
+          <w:b/>
+          <w:sz w:val="24"/>
+        </w:rPr>
+        <w:t>Table 5</w:t>
+      </w:r>
+    </w:p>
+    <w:tbl>
+      <w:tblPr>
+        <w:tblStyle w:val="TableGrid"/>
+        <w:tblW w:type="auto" w:w="0"/>
+        <w:jc w:val="center"/>
+        <w:tblLook w:firstColumn="1" w:firstRow="1" w:lastColumn="0" w:lastRow="0" w:noHBand="0" w:noVBand="1" w:val="04A0"/>
+        <w:tblBorders>
+          <w:top w:val="single" w:sz="6" w:space="0" w:color="000000"/>
+          <w:left w:val="single" w:sz="6" w:space="0" w:color="000000"/>
+          <w:bottom w:val="single" w:sz="6" w:space="0" w:color="000000"/>
+          <w:right w:val="single" w:sz="6" w:space="0" w:color="000000"/>
+          <w:insideH w:val="single" w:sz="6" w:space="0" w:color="000000"/>
+          <w:insideV w:val="single" w:sz="6" w:space="0" w:color="000000"/>
+        </w:tblBorders>
+      </w:tblPr>
+      <w:tblGrid>
+        <w:gridCol w:w="1728"/>
+        <w:gridCol w:w="1728"/>
+        <w:gridCol w:w="1728"/>
+        <w:gridCol w:w="1728"/>
+        <w:gridCol w:w="1728"/>
+      </w:tblGrid>
+      <w:tr>
+        <w:trPr>
+          <w:cantSplit/>
+        </w:trPr>
+        <w:tc>
+          <w:tcPr>
+            <w:tcW w:type="dxa" w:w="1930"/>
+            <w:shd w:fill="E8E8E8"/>
+          </w:tcPr>
+          <w:p>
+            <w:pPr>
+              <w:spacing w:before="40" w:after="40" w:lineRule="auto" w:line="240"/>
+            </w:pPr>
+            <w:r>
+              <w:rPr>
+                <w:b/>
+                <w:sz w:val="18"/>
+              </w:rPr>
+              <w:t>Framework (Jetson AGX Orin, FP16 — manuscript Table 5)</w:t>
+            </w:r>
+          </w:p>
+        </w:tc>
+        <w:tc>
+          <w:tcPr>
+            <w:tcW w:type="dxa" w:w="1930"/>
+            <w:shd w:fill="E8E8E8"/>
+          </w:tcPr>
+          <w:p>
+            <w:pPr>
+              <w:spacing w:before="40" w:after="40" w:lineRule="auto" w:line="240"/>
+            </w:pPr>
+            <w:r>
+              <w:rPr>
+                <w:b/>
+                <w:sz w:val="18"/>
+              </w:rPr>
+              <w:t>Restoration (ms)</w:t>
+            </w:r>
+          </w:p>
+        </w:tc>
+        <w:tc>
+          <w:tcPr>
+            <w:tcW w:type="dxa" w:w="1930"/>
+            <w:shd w:fill="E8E8E8"/>
+          </w:tcPr>
+          <w:p>
+            <w:pPr>
+              <w:spacing w:before="40" w:after="40" w:lineRule="auto" w:line="240"/>
+            </w:pPr>
+            <w:r>
+              <w:rPr>
+                <w:b/>
+                <w:sz w:val="18"/>
+              </w:rPr>
+              <w:t>Seg. (ms)</w:t>
+            </w:r>
+          </w:p>
+        </w:tc>
+        <w:tc>
+          <w:tcPr>
+            <w:tcW w:type="dxa" w:w="1930"/>
+            <w:shd w:fill="E8E8E8"/>
+          </w:tcPr>
+          <w:p>
+            <w:pPr>
+              <w:spacing w:before="40" w:after="40" w:lineRule="auto" w:line="240"/>
+            </w:pPr>
+            <w:r>
+              <w:rPr>
+                <w:b/>
+                <w:sz w:val="18"/>
+              </w:rPr>
+              <w:t>FPS</w:t>
+            </w:r>
+          </w:p>
+        </w:tc>
+        <w:tc>
+          <w:tcPr>
+            <w:tcW w:type="dxa" w:w="1930"/>
+            <w:shd w:fill="E8E8E8"/>
+          </w:tcPr>
+          <w:p>
+            <w:pPr>
+              <w:spacing w:before="40" w:after="40" w:lineRule="auto" w:line="240"/>
+            </w:pPr>
+            <w:r>
+              <w:rPr>
+                <w:b/>
+                <w:sz w:val="18"/>
+              </w:rPr>
+              <w:t>Peak VRAM (MB)</w:t>
+            </w:r>
+          </w:p>
+        </w:tc>
+      </w:tr>
+      <w:tr>
+        <w:trPr>
+          <w:cantSplit/>
+        </w:trPr>
+        <w:tc>
+          <w:tcPr>
+            <w:tcW w:type="dxa" w:w="1930"/>
+          </w:tcPr>
+          <w:p>
+            <w:pPr>
+              <w:spacing w:before="40" w:after="40" w:lineRule="auto" w:line="240"/>
+            </w:pPr>
+            <w:r>
+              <w:rPr>
+                <w:b w:val="0"/>
+                <w:sz w:val="18"/>
+              </w:rPr>
+              <w:t>YOLOv11s + SAM</w:t>
+            </w:r>
+          </w:p>
+        </w:tc>
+        <w:tc>
+          <w:tcPr>
+            <w:tcW w:type="dxa" w:w="1930"/>
+          </w:tcPr>
+          <w:p>
+            <w:pPr>
+              <w:spacing w:before="40" w:after="40" w:lineRule="auto" w:line="240"/>
+            </w:pPr>
+            <w:r>
+              <w:rPr>
+                <w:b w:val="0"/>
+                <w:sz w:val="18"/>
+              </w:rPr>
+              <w:t>5.8</w:t>
+            </w:r>
+          </w:p>
+        </w:tc>
+        <w:tc>
+          <w:tcPr>
+            <w:tcW w:type="dxa" w:w="1930"/>
+          </w:tcPr>
+          <w:p>
+            <w:pPr>
+              <w:spacing w:before="40" w:after="40" w:lineRule="auto" w:line="240"/>
+            </w:pPr>
+            <w:r>
+              <w:rPr>
+                <w:b w:val="0"/>
+                <w:sz w:val="18"/>
+              </w:rPr>
+              <w:t>92.4</w:t>
+            </w:r>
+          </w:p>
+        </w:tc>
+        <w:tc>
+          <w:tcPr>
+            <w:tcW w:type="dxa" w:w="1930"/>
+          </w:tcPr>
+          <w:p>
+            <w:pPr>
+              <w:spacing w:before="40" w:after="40" w:lineRule="auto" w:line="240"/>
+            </w:pPr>
+            <w:r>
+              <w:rPr>
+                <w:b w:val="0"/>
+                <w:sz w:val="18"/>
+              </w:rPr>
+              <w:t>10.2</w:t>
+            </w:r>
+          </w:p>
+        </w:tc>
+        <w:tc>
+          <w:tcPr>
+            <w:tcW w:type="dxa" w:w="1930"/>
+          </w:tcPr>
+          <w:p>
+            <w:pPr>
+              <w:spacing w:before="40" w:after="40" w:lineRule="auto" w:line="240"/>
+            </w:pPr>
+            <w:r>
+              <w:rPr>
+                <w:b w:val="0"/>
+                <w:sz w:val="18"/>
+              </w:rPr>
+              <w:t>6480</w:t>
+            </w:r>
+          </w:p>
+        </w:tc>
+      </w:tr>
+      <w:tr>
+        <w:trPr>
+          <w:cantSplit/>
+        </w:trPr>
+        <w:tc>
+          <w:tcPr>
+            <w:tcW w:type="dxa" w:w="1930"/>
+          </w:tcPr>
+          <w:p>
+            <w:pPr>
+              <w:spacing w:before="40" w:after="40" w:lineRule="auto" w:line="240"/>
+            </w:pPr>
+            <w:r>
+              <w:rPr>
+                <w:b w:val="0"/>
+                <w:sz w:val="18"/>
+              </w:rPr>
+              <w:t>Grounding DINO + SAM</w:t>
+            </w:r>
+          </w:p>
+        </w:tc>
+        <w:tc>
+          <w:tcPr>
+            <w:tcW w:type="dxa" w:w="1930"/>
+          </w:tcPr>
+          <w:p>
+            <w:pPr>
+              <w:spacing w:before="40" w:after="40" w:lineRule="auto" w:line="240"/>
+            </w:pPr>
+            <w:r>
+              <w:rPr>
+                <w:b w:val="0"/>
+                <w:sz w:val="18"/>
+              </w:rPr>
+              <w:t>5.8</w:t>
+            </w:r>
+          </w:p>
+        </w:tc>
+        <w:tc>
+          <w:tcPr>
+            <w:tcW w:type="dxa" w:w="1930"/>
+          </w:tcPr>
+          <w:p>
+            <w:pPr>
+              <w:spacing w:before="40" w:after="40" w:lineRule="auto" w:line="240"/>
+            </w:pPr>
+            <w:r>
+              <w:rPr>
+                <w:b w:val="0"/>
+                <w:sz w:val="18"/>
+              </w:rPr>
+              <w:t>128.2</w:t>
+            </w:r>
+          </w:p>
+        </w:tc>
+        <w:tc>
+          <w:tcPr>
+            <w:tcW w:type="dxa" w:w="1930"/>
+          </w:tcPr>
+          <w:p>
+            <w:pPr>
+              <w:spacing w:before="40" w:after="40" w:lineRule="auto" w:line="240"/>
+            </w:pPr>
+            <w:r>
+              <w:rPr>
+                <w:b w:val="0"/>
+                <w:sz w:val="18"/>
+              </w:rPr>
+              <w:t>7.8</w:t>
+            </w:r>
+          </w:p>
+        </w:tc>
+        <w:tc>
+          <w:tcPr>
+            <w:tcW w:type="dxa" w:w="1930"/>
+          </w:tcPr>
+          <w:p>
+            <w:pPr>
+              <w:spacing w:before="40" w:after="40" w:lineRule="auto" w:line="240"/>
+            </w:pPr>
+            <w:r>
+              <w:rPr>
+                <w:b w:val="0"/>
+                <w:sz w:val="18"/>
+              </w:rPr>
+              <w:t>7920</w:t>
+            </w:r>
+          </w:p>
+        </w:tc>
+      </w:tr>
+      <w:tr>
+        <w:trPr>
+          <w:cantSplit/>
+        </w:trPr>
+        <w:tc>
+          <w:tcPr>
+            <w:tcW w:type="dxa" w:w="1930"/>
+          </w:tcPr>
+          <w:p>
+            <w:pPr>
+              <w:spacing w:before="40" w:after="40" w:lineRule="auto" w:line="240"/>
+            </w:pPr>
+            <w:r>
+              <w:rPr>
+                <w:b/>
+                <w:sz w:val="18"/>
+              </w:rPr>
+              <w:t>Proposed causal pipeline</w:t>
+            </w:r>
+          </w:p>
+        </w:tc>
+        <w:tc>
+          <w:tcPr>
+            <w:tcW w:type="dxa" w:w="1930"/>
+          </w:tcPr>
+          <w:p>
+            <w:pPr>
+              <w:spacing w:before="40" w:after="40" w:lineRule="auto" w:line="240"/>
+            </w:pPr>
+            <w:r>
+              <w:rPr>
+                <w:b/>
+                <w:sz w:val="18"/>
+              </w:rPr>
+              <w:t>5.8</w:t>
+            </w:r>
+          </w:p>
+        </w:tc>
+        <w:tc>
+          <w:tcPr>
+            <w:tcW w:type="dxa" w:w="1930"/>
+          </w:tcPr>
+          <w:p>
+            <w:pPr>
+              <w:spacing w:before="40" w:after="40" w:lineRule="auto" w:line="240"/>
+            </w:pPr>
+            <w:r>
+              <w:rPr>
+                <w:b/>
+                <w:sz w:val="18"/>
+              </w:rPr>
+              <w:t>29.1</w:t>
+            </w:r>
+          </w:p>
+        </w:tc>
+        <w:tc>
+          <w:tcPr>
+            <w:tcW w:type="dxa" w:w="1930"/>
+          </w:tcPr>
+          <w:p>
+            <w:pPr>
+              <w:spacing w:before="40" w:after="40" w:lineRule="auto" w:line="240"/>
+            </w:pPr>
+            <w:r>
+              <w:rPr>
+                <w:b/>
+                <w:sz w:val="18"/>
+              </w:rPr>
+              <w:t>28.6</w:t>
+            </w:r>
+          </w:p>
+        </w:tc>
+        <w:tc>
+          <w:tcPr>
+            <w:tcW w:type="dxa" w:w="1930"/>
+          </w:tcPr>
+          <w:p>
+            <w:pPr>
+              <w:spacing w:before="40" w:after="40" w:lineRule="auto" w:line="240"/>
+            </w:pPr>
+            <w:r>
+              <w:rPr>
+                <w:b/>
+                <w:sz w:val="18"/>
+              </w:rPr>
+              <w:t>4005</w:t>
+            </w:r>
+          </w:p>
+        </w:tc>
+      </w:tr>
+    </w:tbl>
+    <w:p>
+      <w:pPr>
+        <w:spacing w:before="40" w:after="120" w:lineRule="auto" w:line="276"/>
+      </w:pPr>
+      <w:r>
+        <w:rPr>
+          <w:i/>
+          <w:sz w:val="18"/>
+        </w:rPr>
+        <w:t>Embedded efficiency on NVIDIA Jetson AGX Orin, FP16 (manuscript Table 5).</w:t>
       </w:r>
     </w:p>
     <w:sectPr>

</xml_diff>

<commit_message>
Renumber supplementary tables 6-8 (manuscript 4, 2, 5) in order.
</commit_message>
<xml_diff>
--- a/appendix_tables.docx
+++ b/appendix_tables.docx
@@ -11,7 +11,7 @@
           <w:b/>
           <w:sz w:val="28"/>
         </w:rPr>
-        <w:t>Supplementary quantitative tables</w:t>
+        <w:t>Supplementary Tables 6–8</w:t>
       </w:r>
     </w:p>
     <w:p>
@@ -22,7 +22,7 @@
         <w:rPr>
           <w:sz w:val="20"/>
         </w:rPr>
-        <w:t>Tables 2, 4, and 5 (excerpts) from the dashcam causal segmentation manuscript. Bold values match the rebuttal / README layout.</w:t>
+        <w:t>Table 6 (manuscript Table 4), Table 7 (manuscript Table 2), and Table 8 (manuscript Table 5). Bold values match the README layout.</w:t>
       </w:r>
     </w:p>
     <w:p>
@@ -34,7 +34,7 @@
           <w:b/>
           <w:sz w:val="24"/>
         </w:rPr>
-        <w:t>Table 2</w:t>
+        <w:t>Table 6</w:t>
       </w:r>
     </w:p>
     <w:tbl>
@@ -76,349 +76,7 @@
                 <w:b/>
                 <w:sz w:val="18"/>
               </w:rPr>
-              <w:t>Method (manuscript Table 2)</w:t>
-            </w:r>
-          </w:p>
-        </w:tc>
-        <w:tc>
-          <w:tcPr>
-            <w:tcW w:type="dxa" w:w="2412"/>
-            <w:shd w:fill="E8E8E8"/>
-          </w:tcPr>
-          <w:p>
-            <w:pPr>
-              <w:spacing w:before="40" w:after="40" w:lineRule="auto" w:line="240"/>
-            </w:pPr>
-            <w:r>
-              <w:rPr>
-                <w:b/>
-                <w:sz w:val="18"/>
-              </w:rPr>
-              <w:t>mIoU (%)</w:t>
-            </w:r>
-          </w:p>
-        </w:tc>
-        <w:tc>
-          <w:tcPr>
-            <w:tcW w:type="dxa" w:w="2412"/>
-            <w:shd w:fill="E8E8E8"/>
-          </w:tcPr>
-          <w:p>
-            <w:pPr>
-              <w:spacing w:before="40" w:after="40" w:lineRule="auto" w:line="240"/>
-            </w:pPr>
-            <w:r>
-              <w:rPr>
-                <w:b/>
-                <w:sz w:val="18"/>
-              </w:rPr>
-              <w:t>mTC (%)</w:t>
-            </w:r>
-          </w:p>
-        </w:tc>
-        <w:tc>
-          <w:tcPr>
-            <w:tcW w:type="dxa" w:w="2412"/>
-            <w:shd w:fill="E8E8E8"/>
-          </w:tcPr>
-          <w:p>
-            <w:pPr>
-              <w:spacing w:before="40" w:after="40" w:lineRule="auto" w:line="240"/>
-            </w:pPr>
-            <w:r>
-              <w:rPr>
-                <w:b/>
-                <w:sz w:val="18"/>
-              </w:rPr>
-              <w:t>FPS</w:t>
-            </w:r>
-          </w:p>
-        </w:tc>
-      </w:tr>
-      <w:tr>
-        <w:trPr>
-          <w:cantSplit/>
-        </w:trPr>
-        <w:tc>
-          <w:tcPr>
-            <w:tcW w:type="dxa" w:w="2412"/>
-          </w:tcPr>
-          <w:p>
-            <w:pPr>
-              <w:spacing w:before="40" w:after="40" w:lineRule="auto" w:line="240"/>
-            </w:pPr>
-            <w:r>
-              <w:rPr>
-                <w:b w:val="0"/>
-                <w:sz w:val="18"/>
-              </w:rPr>
-              <w:t>SAM (per-frame zero-shot)</w:t>
-            </w:r>
-          </w:p>
-        </w:tc>
-        <w:tc>
-          <w:tcPr>
-            <w:tcW w:type="dxa" w:w="2412"/>
-          </w:tcPr>
-          <w:p>
-            <w:pPr>
-              <w:spacing w:before="40" w:after="40" w:lineRule="auto" w:line="240"/>
-            </w:pPr>
-            <w:r>
-              <w:rPr>
-                <w:b w:val="0"/>
-                <w:sz w:val="18"/>
-              </w:rPr>
-              <w:t>62.5</w:t>
-            </w:r>
-          </w:p>
-        </w:tc>
-        <w:tc>
-          <w:tcPr>
-            <w:tcW w:type="dxa" w:w="2412"/>
-          </w:tcPr>
-          <w:p>
-            <w:pPr>
-              <w:spacing w:before="40" w:after="40" w:lineRule="auto" w:line="240"/>
-            </w:pPr>
-            <w:r>
-              <w:rPr>
-                <w:b w:val="0"/>
-                <w:sz w:val="18"/>
-              </w:rPr>
-              <w:t>64.1</w:t>
-            </w:r>
-          </w:p>
-        </w:tc>
-        <w:tc>
-          <w:tcPr>
-            <w:tcW w:type="dxa" w:w="2412"/>
-          </w:tcPr>
-          <w:p>
-            <w:pPr>
-              <w:spacing w:before="40" w:after="40" w:lineRule="auto" w:line="240"/>
-            </w:pPr>
-            <w:r>
-              <w:rPr>
-                <w:b w:val="0"/>
-                <w:sz w:val="18"/>
-              </w:rPr>
-              <w:t>12.3</w:t>
-            </w:r>
-          </w:p>
-        </w:tc>
-      </w:tr>
-      <w:tr>
-        <w:trPr>
-          <w:cantSplit/>
-        </w:trPr>
-        <w:tc>
-          <w:tcPr>
-            <w:tcW w:type="dxa" w:w="2412"/>
-          </w:tcPr>
-          <w:p>
-            <w:pPr>
-              <w:spacing w:before="40" w:after="40" w:lineRule="auto" w:line="240"/>
-            </w:pPr>
-            <w:r>
-              <w:rPr>
-                <w:b w:val="0"/>
-                <w:sz w:val="18"/>
-              </w:rPr>
-              <w:t>SAM 2 (streaming video)</w:t>
-            </w:r>
-          </w:p>
-        </w:tc>
-        <w:tc>
-          <w:tcPr>
-            <w:tcW w:type="dxa" w:w="2412"/>
-          </w:tcPr>
-          <w:p>
-            <w:pPr>
-              <w:spacing w:before="40" w:after="40" w:lineRule="auto" w:line="240"/>
-            </w:pPr>
-            <w:r>
-              <w:rPr>
-                <w:b w:val="0"/>
-                <w:sz w:val="18"/>
-              </w:rPr>
-              <w:t>71.6</w:t>
-            </w:r>
-          </w:p>
-        </w:tc>
-        <w:tc>
-          <w:tcPr>
-            <w:tcW w:type="dxa" w:w="2412"/>
-          </w:tcPr>
-          <w:p>
-            <w:pPr>
-              <w:spacing w:before="40" w:after="40" w:lineRule="auto" w:line="240"/>
-            </w:pPr>
-            <w:r>
-              <w:rPr>
-                <w:b w:val="0"/>
-                <w:sz w:val="18"/>
-              </w:rPr>
-              <w:t>85.1</w:t>
-            </w:r>
-          </w:p>
-        </w:tc>
-        <w:tc>
-          <w:tcPr>
-            <w:tcW w:type="dxa" w:w="2412"/>
-          </w:tcPr>
-          <w:p>
-            <w:pPr>
-              <w:spacing w:before="40" w:after="40" w:lineRule="auto" w:line="240"/>
-            </w:pPr>
-            <w:r>
-              <w:rPr>
-                <w:b w:val="0"/>
-                <w:sz w:val="18"/>
-              </w:rPr>
-              <w:t>22.4</w:t>
-            </w:r>
-          </w:p>
-        </w:tc>
-      </w:tr>
-      <w:tr>
-        <w:trPr>
-          <w:cantSplit/>
-        </w:trPr>
-        <w:tc>
-          <w:tcPr>
-            <w:tcW w:type="dxa" w:w="2412"/>
-          </w:tcPr>
-          <w:p>
-            <w:pPr>
-              <w:spacing w:before="40" w:after="40" w:lineRule="auto" w:line="240"/>
-            </w:pPr>
-            <w:r>
-              <w:rPr>
-                <w:b/>
-                <w:sz w:val="18"/>
-              </w:rPr>
-              <w:t>Restoration + SAM 3 (causal PCS) — ours</w:t>
-            </w:r>
-          </w:p>
-        </w:tc>
-        <w:tc>
-          <w:tcPr>
-            <w:tcW w:type="dxa" w:w="2412"/>
-          </w:tcPr>
-          <w:p>
-            <w:pPr>
-              <w:spacing w:before="40" w:after="40" w:lineRule="auto" w:line="240"/>
-            </w:pPr>
-            <w:r>
-              <w:rPr>
-                <w:b/>
-                <w:sz w:val="18"/>
-              </w:rPr>
-              <w:t>74.8</w:t>
-            </w:r>
-          </w:p>
-        </w:tc>
-        <w:tc>
-          <w:tcPr>
-            <w:tcW w:type="dxa" w:w="2412"/>
-          </w:tcPr>
-          <w:p>
-            <w:pPr>
-              <w:spacing w:before="40" w:after="40" w:lineRule="auto" w:line="240"/>
-            </w:pPr>
-            <w:r>
-              <w:rPr>
-                <w:b/>
-                <w:sz w:val="18"/>
-              </w:rPr>
-              <w:t>88.4</w:t>
-            </w:r>
-          </w:p>
-        </w:tc>
-        <w:tc>
-          <w:tcPr>
-            <w:tcW w:type="dxa" w:w="2412"/>
-          </w:tcPr>
-          <w:p>
-            <w:pPr>
-              <w:spacing w:before="40" w:after="40" w:lineRule="auto" w:line="240"/>
-            </w:pPr>
-            <w:r>
-              <w:rPr>
-                <w:b/>
-                <w:sz w:val="18"/>
-              </w:rPr>
-              <w:t>28.6</w:t>
-            </w:r>
-          </w:p>
-        </w:tc>
-      </w:tr>
-    </w:tbl>
-    <w:p>
-      <w:pPr>
-        <w:spacing w:before="40" w:after="120" w:lineRule="auto" w:line="276"/>
-      </w:pPr>
-      <w:r>
-        <w:rPr>
-          <w:i/>
-          <w:sz w:val="18"/>
-        </w:rPr>
-        <w:t>Comparative benchmark excerpt (manuscript Table 2).</w:t>
-      </w:r>
-    </w:p>
-    <w:p>
-      <w:pPr>
-        <w:spacing w:before="120" w:after="80" w:lineRule="auto" w:line="276"/>
-      </w:pPr>
-      <w:r>
-        <w:rPr>
-          <w:b/>
-          <w:sz w:val="24"/>
-        </w:rPr>
-        <w:t>Table 4</w:t>
-      </w:r>
-    </w:p>
-    <w:tbl>
-      <w:tblPr>
-        <w:tblStyle w:val="TableGrid"/>
-        <w:tblW w:type="auto" w:w="0"/>
-        <w:jc w:val="center"/>
-        <w:tblLook w:firstColumn="1" w:firstRow="1" w:lastColumn="0" w:lastRow="0" w:noHBand="0" w:noVBand="1" w:val="04A0"/>
-        <w:tblBorders>
-          <w:top w:val="single" w:sz="6" w:space="0" w:color="000000"/>
-          <w:left w:val="single" w:sz="6" w:space="0" w:color="000000"/>
-          <w:bottom w:val="single" w:sz="6" w:space="0" w:color="000000"/>
-          <w:right w:val="single" w:sz="6" w:space="0" w:color="000000"/>
-          <w:insideH w:val="single" w:sz="6" w:space="0" w:color="000000"/>
-          <w:insideV w:val="single" w:sz="6" w:space="0" w:color="000000"/>
-        </w:tblBorders>
-      </w:tblPr>
-      <w:tblGrid>
-        <w:gridCol w:w="2160"/>
-        <w:gridCol w:w="2160"/>
-        <w:gridCol w:w="2160"/>
-        <w:gridCol w:w="2160"/>
-      </w:tblGrid>
-      <w:tr>
-        <w:trPr>
-          <w:cantSplit/>
-        </w:trPr>
-        <w:tc>
-          <w:tcPr>
-            <w:tcW w:type="dxa" w:w="2412"/>
-            <w:shd w:fill="E8E8E8"/>
-          </w:tcPr>
-          <w:p>
-            <w:pPr>
-              <w:spacing w:before="40" w:after="40" w:lineRule="auto" w:line="240"/>
-            </w:pPr>
-            <w:r>
-              <w:rPr>
-                <w:b/>
-                <w:sz w:val="18"/>
-              </w:rPr>
-              <w:t>Restoration pipeline stage (manuscript Table 4)</w:t>
+              <w:t>Restoration pipeline stage (Table 6)</w:t>
             </w:r>
           </w:p>
         </w:tc>
@@ -1290,7 +948,7 @@
           <w:i/>
           <w:sz w:val="18"/>
         </w:rPr>
-        <w:t>Tri-stage restoration ablation and one-at-a-time hyperparameter sweeps (manuscript Table 4; SAM 3 + causal segmentation fixed).</w:t>
+        <w:t>Tri-stage restoration ablation and hyperparameter sweeps (manuscript Table 4).</w:t>
       </w:r>
     </w:p>
     <w:p>
@@ -1302,7 +960,349 @@
           <w:b/>
           <w:sz w:val="24"/>
         </w:rPr>
-        <w:t>Table 5</w:t>
+        <w:t>Table 7</w:t>
+      </w:r>
+    </w:p>
+    <w:tbl>
+      <w:tblPr>
+        <w:tblStyle w:val="TableGrid"/>
+        <w:tblW w:type="auto" w:w="0"/>
+        <w:jc w:val="center"/>
+        <w:tblLook w:firstColumn="1" w:firstRow="1" w:lastColumn="0" w:lastRow="0" w:noHBand="0" w:noVBand="1" w:val="04A0"/>
+        <w:tblBorders>
+          <w:top w:val="single" w:sz="6" w:space="0" w:color="000000"/>
+          <w:left w:val="single" w:sz="6" w:space="0" w:color="000000"/>
+          <w:bottom w:val="single" w:sz="6" w:space="0" w:color="000000"/>
+          <w:right w:val="single" w:sz="6" w:space="0" w:color="000000"/>
+          <w:insideH w:val="single" w:sz="6" w:space="0" w:color="000000"/>
+          <w:insideV w:val="single" w:sz="6" w:space="0" w:color="000000"/>
+        </w:tblBorders>
+      </w:tblPr>
+      <w:tblGrid>
+        <w:gridCol w:w="2160"/>
+        <w:gridCol w:w="2160"/>
+        <w:gridCol w:w="2160"/>
+        <w:gridCol w:w="2160"/>
+      </w:tblGrid>
+      <w:tr>
+        <w:trPr>
+          <w:cantSplit/>
+        </w:trPr>
+        <w:tc>
+          <w:tcPr>
+            <w:tcW w:type="dxa" w:w="2412"/>
+            <w:shd w:fill="E8E8E8"/>
+          </w:tcPr>
+          <w:p>
+            <w:pPr>
+              <w:spacing w:before="40" w:after="40" w:lineRule="auto" w:line="240"/>
+            </w:pPr>
+            <w:r>
+              <w:rPr>
+                <w:b/>
+                <w:sz w:val="18"/>
+              </w:rPr>
+              <w:t>Method (Table 7)</w:t>
+            </w:r>
+          </w:p>
+        </w:tc>
+        <w:tc>
+          <w:tcPr>
+            <w:tcW w:type="dxa" w:w="2412"/>
+            <w:shd w:fill="E8E8E8"/>
+          </w:tcPr>
+          <w:p>
+            <w:pPr>
+              <w:spacing w:before="40" w:after="40" w:lineRule="auto" w:line="240"/>
+            </w:pPr>
+            <w:r>
+              <w:rPr>
+                <w:b/>
+                <w:sz w:val="18"/>
+              </w:rPr>
+              <w:t>mIoU (%)</w:t>
+            </w:r>
+          </w:p>
+        </w:tc>
+        <w:tc>
+          <w:tcPr>
+            <w:tcW w:type="dxa" w:w="2412"/>
+            <w:shd w:fill="E8E8E8"/>
+          </w:tcPr>
+          <w:p>
+            <w:pPr>
+              <w:spacing w:before="40" w:after="40" w:lineRule="auto" w:line="240"/>
+            </w:pPr>
+            <w:r>
+              <w:rPr>
+                <w:b/>
+                <w:sz w:val="18"/>
+              </w:rPr>
+              <w:t>mTC (%)</w:t>
+            </w:r>
+          </w:p>
+        </w:tc>
+        <w:tc>
+          <w:tcPr>
+            <w:tcW w:type="dxa" w:w="2412"/>
+            <w:shd w:fill="E8E8E8"/>
+          </w:tcPr>
+          <w:p>
+            <w:pPr>
+              <w:spacing w:before="40" w:after="40" w:lineRule="auto" w:line="240"/>
+            </w:pPr>
+            <w:r>
+              <w:rPr>
+                <w:b/>
+                <w:sz w:val="18"/>
+              </w:rPr>
+              <w:t>FPS</w:t>
+            </w:r>
+          </w:p>
+        </w:tc>
+      </w:tr>
+      <w:tr>
+        <w:trPr>
+          <w:cantSplit/>
+        </w:trPr>
+        <w:tc>
+          <w:tcPr>
+            <w:tcW w:type="dxa" w:w="2412"/>
+          </w:tcPr>
+          <w:p>
+            <w:pPr>
+              <w:spacing w:before="40" w:after="40" w:lineRule="auto" w:line="240"/>
+            </w:pPr>
+            <w:r>
+              <w:rPr>
+                <w:b w:val="0"/>
+                <w:sz w:val="18"/>
+              </w:rPr>
+              <w:t>SAM (per-frame zero-shot)</w:t>
+            </w:r>
+          </w:p>
+        </w:tc>
+        <w:tc>
+          <w:tcPr>
+            <w:tcW w:type="dxa" w:w="2412"/>
+          </w:tcPr>
+          <w:p>
+            <w:pPr>
+              <w:spacing w:before="40" w:after="40" w:lineRule="auto" w:line="240"/>
+            </w:pPr>
+            <w:r>
+              <w:rPr>
+                <w:b w:val="0"/>
+                <w:sz w:val="18"/>
+              </w:rPr>
+              <w:t>62.5</w:t>
+            </w:r>
+          </w:p>
+        </w:tc>
+        <w:tc>
+          <w:tcPr>
+            <w:tcW w:type="dxa" w:w="2412"/>
+          </w:tcPr>
+          <w:p>
+            <w:pPr>
+              <w:spacing w:before="40" w:after="40" w:lineRule="auto" w:line="240"/>
+            </w:pPr>
+            <w:r>
+              <w:rPr>
+                <w:b w:val="0"/>
+                <w:sz w:val="18"/>
+              </w:rPr>
+              <w:t>64.1</w:t>
+            </w:r>
+          </w:p>
+        </w:tc>
+        <w:tc>
+          <w:tcPr>
+            <w:tcW w:type="dxa" w:w="2412"/>
+          </w:tcPr>
+          <w:p>
+            <w:pPr>
+              <w:spacing w:before="40" w:after="40" w:lineRule="auto" w:line="240"/>
+            </w:pPr>
+            <w:r>
+              <w:rPr>
+                <w:b w:val="0"/>
+                <w:sz w:val="18"/>
+              </w:rPr>
+              <w:t>12.3</w:t>
+            </w:r>
+          </w:p>
+        </w:tc>
+      </w:tr>
+      <w:tr>
+        <w:trPr>
+          <w:cantSplit/>
+        </w:trPr>
+        <w:tc>
+          <w:tcPr>
+            <w:tcW w:type="dxa" w:w="2412"/>
+          </w:tcPr>
+          <w:p>
+            <w:pPr>
+              <w:spacing w:before="40" w:after="40" w:lineRule="auto" w:line="240"/>
+            </w:pPr>
+            <w:r>
+              <w:rPr>
+                <w:b w:val="0"/>
+                <w:sz w:val="18"/>
+              </w:rPr>
+              <w:t>SAM 2 (streaming video)</w:t>
+            </w:r>
+          </w:p>
+        </w:tc>
+        <w:tc>
+          <w:tcPr>
+            <w:tcW w:type="dxa" w:w="2412"/>
+          </w:tcPr>
+          <w:p>
+            <w:pPr>
+              <w:spacing w:before="40" w:after="40" w:lineRule="auto" w:line="240"/>
+            </w:pPr>
+            <w:r>
+              <w:rPr>
+                <w:b w:val="0"/>
+                <w:sz w:val="18"/>
+              </w:rPr>
+              <w:t>71.6</w:t>
+            </w:r>
+          </w:p>
+        </w:tc>
+        <w:tc>
+          <w:tcPr>
+            <w:tcW w:type="dxa" w:w="2412"/>
+          </w:tcPr>
+          <w:p>
+            <w:pPr>
+              <w:spacing w:before="40" w:after="40" w:lineRule="auto" w:line="240"/>
+            </w:pPr>
+            <w:r>
+              <w:rPr>
+                <w:b w:val="0"/>
+                <w:sz w:val="18"/>
+              </w:rPr>
+              <w:t>85.1</w:t>
+            </w:r>
+          </w:p>
+        </w:tc>
+        <w:tc>
+          <w:tcPr>
+            <w:tcW w:type="dxa" w:w="2412"/>
+          </w:tcPr>
+          <w:p>
+            <w:pPr>
+              <w:spacing w:before="40" w:after="40" w:lineRule="auto" w:line="240"/>
+            </w:pPr>
+            <w:r>
+              <w:rPr>
+                <w:b w:val="0"/>
+                <w:sz w:val="18"/>
+              </w:rPr>
+              <w:t>22.4</w:t>
+            </w:r>
+          </w:p>
+        </w:tc>
+      </w:tr>
+      <w:tr>
+        <w:trPr>
+          <w:cantSplit/>
+        </w:trPr>
+        <w:tc>
+          <w:tcPr>
+            <w:tcW w:type="dxa" w:w="2412"/>
+          </w:tcPr>
+          <w:p>
+            <w:pPr>
+              <w:spacing w:before="40" w:after="40" w:lineRule="auto" w:line="240"/>
+            </w:pPr>
+            <w:r>
+              <w:rPr>
+                <w:b/>
+                <w:sz w:val="18"/>
+              </w:rPr>
+              <w:t>Restoration + SAM 3 (causal PCS) — ours</w:t>
+            </w:r>
+          </w:p>
+        </w:tc>
+        <w:tc>
+          <w:tcPr>
+            <w:tcW w:type="dxa" w:w="2412"/>
+          </w:tcPr>
+          <w:p>
+            <w:pPr>
+              <w:spacing w:before="40" w:after="40" w:lineRule="auto" w:line="240"/>
+            </w:pPr>
+            <w:r>
+              <w:rPr>
+                <w:b/>
+                <w:sz w:val="18"/>
+              </w:rPr>
+              <w:t>74.8</w:t>
+            </w:r>
+          </w:p>
+        </w:tc>
+        <w:tc>
+          <w:tcPr>
+            <w:tcW w:type="dxa" w:w="2412"/>
+          </w:tcPr>
+          <w:p>
+            <w:pPr>
+              <w:spacing w:before="40" w:after="40" w:lineRule="auto" w:line="240"/>
+            </w:pPr>
+            <w:r>
+              <w:rPr>
+                <w:b/>
+                <w:sz w:val="18"/>
+              </w:rPr>
+              <w:t>88.4</w:t>
+            </w:r>
+          </w:p>
+        </w:tc>
+        <w:tc>
+          <w:tcPr>
+            <w:tcW w:type="dxa" w:w="2412"/>
+          </w:tcPr>
+          <w:p>
+            <w:pPr>
+              <w:spacing w:before="40" w:after="40" w:lineRule="auto" w:line="240"/>
+            </w:pPr>
+            <w:r>
+              <w:rPr>
+                <w:b/>
+                <w:sz w:val="18"/>
+              </w:rPr>
+              <w:t>28.6</w:t>
+            </w:r>
+          </w:p>
+        </w:tc>
+      </w:tr>
+    </w:tbl>
+    <w:p>
+      <w:pPr>
+        <w:spacing w:before="40" w:after="120" w:lineRule="auto" w:line="276"/>
+      </w:pPr>
+      <w:r>
+        <w:rPr>
+          <w:i/>
+          <w:sz w:val="18"/>
+        </w:rPr>
+        <w:t>Comparative benchmark excerpt (manuscript Table 2).</w:t>
+      </w:r>
+    </w:p>
+    <w:p>
+      <w:pPr>
+        <w:spacing w:before="120" w:after="80" w:lineRule="auto" w:line="276"/>
+      </w:pPr>
+      <w:r>
+        <w:rPr>
+          <w:b/>
+          <w:sz w:val="24"/>
+        </w:rPr>
+        <w:t>Table 8</w:t>
       </w:r>
     </w:p>
     <w:tbl>
@@ -1345,7 +1345,7 @@
                 <w:b/>
                 <w:sz w:val="18"/>
               </w:rPr>
-              <w:t>Framework (Jetson AGX Orin, FP16 — manuscript Table 5)</w:t>
+              <w:t>Framework (Table 8)</w:t>
             </w:r>
           </w:p>
         </w:tc>
@@ -1702,7 +1702,7 @@
           <w:i/>
           <w:sz w:val="18"/>
         </w:rPr>
-        <w:t>Embedded efficiency on NVIDIA Jetson AGX Orin, FP16 (manuscript Table 5).</w:t>
+        <w:t>Embedded efficiency, Jetson AGX Orin FP16 (manuscript Table 5).</w:t>
       </w:r>
     </w:p>
     <w:sectPr>

</xml_diff>

<commit_message>
Label manuscript Table 4 as supplementary Table 5; order 5, 7, 8.
</commit_message>
<xml_diff>
--- a/appendix_tables.docx
+++ b/appendix_tables.docx
@@ -11,7 +11,7 @@
           <w:b/>
           <w:sz w:val="28"/>
         </w:rPr>
-        <w:t>Supplementary Tables 6–8</w:t>
+        <w:t>Supplementary Tables 5, 7, and 8</w:t>
       </w:r>
     </w:p>
     <w:p>
@@ -22,7 +22,7 @@
         <w:rPr>
           <w:sz w:val="20"/>
         </w:rPr>
-        <w:t>Table 6 (manuscript Table 4), Table 7 (manuscript Table 2), and Table 8 (manuscript Table 5). Bold values match the README layout.</w:t>
+        <w:t>Table 5 (manuscript Table 4), Table 7 (manuscript Table 2), and Table 8 (manuscript Table 5). Bold values match the README layout.</w:t>
       </w:r>
     </w:p>
     <w:p>
@@ -34,7 +34,7 @@
           <w:b/>
           <w:sz w:val="24"/>
         </w:rPr>
-        <w:t>Table 6</w:t>
+        <w:t>Table 5</w:t>
       </w:r>
     </w:p>
     <w:tbl>
@@ -76,7 +76,7 @@
                 <w:b/>
                 <w:sz w:val="18"/>
               </w:rPr>
-              <w:t>Restoration pipeline stage (Table 6)</w:t>
+              <w:t>Restoration pipeline stage (Table 5)</w:t>
             </w:r>
           </w:p>
         </w:tc>

</xml_diff>

<commit_message>
Keep Tables 6 and 7 only; rename Table 5 to 6; add titles.
</commit_message>
<xml_diff>
--- a/appendix_tables.docx
+++ b/appendix_tables.docx
@@ -11,7 +11,7 @@
           <w:b/>
           <w:sz w:val="28"/>
         </w:rPr>
-        <w:t>Supplementary Tables 5, 7, and 8</w:t>
+        <w:t>Supplementary Tables 6 and 7</w:t>
       </w:r>
     </w:p>
     <w:p>
@@ -22,7 +22,7 @@
         <w:rPr>
           <w:sz w:val="20"/>
         </w:rPr>
-        <w:t>Table 5 (manuscript Table 4), Table 7 (manuscript Table 2), and Table 8 (manuscript Table 5). Bold values match the README layout.</w:t>
+        <w:t>Table 6 (manuscript Table 4) and Table 7 (manuscript Table 2). Bold values match the README layout.</w:t>
       </w:r>
     </w:p>
     <w:p>
@@ -34,7 +34,7 @@
           <w:b/>
           <w:sz w:val="24"/>
         </w:rPr>
-        <w:t>Table 5</w:t>
+        <w:t>Table 6 — Tri-stage restoration ablation and hyperparameter sensitivity</w:t>
       </w:r>
     </w:p>
     <w:tbl>
@@ -76,7 +76,7 @@
                 <w:b/>
                 <w:sz w:val="18"/>
               </w:rPr>
-              <w:t>Restoration pipeline stage (Table 5)</w:t>
+              <w:t>Restoration pipeline stage (Table 6)</w:t>
             </w:r>
           </w:p>
         </w:tc>
@@ -948,7 +948,7 @@
           <w:i/>
           <w:sz w:val="18"/>
         </w:rPr>
-        <w:t>Tri-stage restoration ablation and hyperparameter sweeps (manuscript Table 4).</w:t>
+        <w:t>Component-wise ablation and hyperparameter sweeps with SAM 3 + causal segmentation fixed (manuscript Table 4).</w:t>
       </w:r>
     </w:p>
     <w:p>
@@ -960,7 +960,7 @@
           <w:b/>
           <w:sz w:val="24"/>
         </w:rPr>
-        <w:t>Table 7</w:t>
+        <w:t>Table 7 — Comparative benchmark (excerpt)</w:t>
       </w:r>
     </w:p>
     <w:tbl>
@@ -1290,419 +1290,7 @@
           <w:i/>
           <w:sz w:val="18"/>
         </w:rPr>
-        <w:t>Comparative benchmark excerpt (manuscript Table 2).</w:t>
-      </w:r>
-    </w:p>
-    <w:p>
-      <w:pPr>
-        <w:spacing w:before="120" w:after="80" w:lineRule="auto" w:line="276"/>
-      </w:pPr>
-      <w:r>
-        <w:rPr>
-          <w:b/>
-          <w:sz w:val="24"/>
-        </w:rPr>
-        <w:t>Table 8</w:t>
-      </w:r>
-    </w:p>
-    <w:tbl>
-      <w:tblPr>
-        <w:tblStyle w:val="TableGrid"/>
-        <w:tblW w:type="auto" w:w="0"/>
-        <w:jc w:val="center"/>
-        <w:tblLook w:firstColumn="1" w:firstRow="1" w:lastColumn="0" w:lastRow="0" w:noHBand="0" w:noVBand="1" w:val="04A0"/>
-        <w:tblBorders>
-          <w:top w:val="single" w:sz="6" w:space="0" w:color="000000"/>
-          <w:left w:val="single" w:sz="6" w:space="0" w:color="000000"/>
-          <w:bottom w:val="single" w:sz="6" w:space="0" w:color="000000"/>
-          <w:right w:val="single" w:sz="6" w:space="0" w:color="000000"/>
-          <w:insideH w:val="single" w:sz="6" w:space="0" w:color="000000"/>
-          <w:insideV w:val="single" w:sz="6" w:space="0" w:color="000000"/>
-        </w:tblBorders>
-      </w:tblPr>
-      <w:tblGrid>
-        <w:gridCol w:w="1728"/>
-        <w:gridCol w:w="1728"/>
-        <w:gridCol w:w="1728"/>
-        <w:gridCol w:w="1728"/>
-        <w:gridCol w:w="1728"/>
-      </w:tblGrid>
-      <w:tr>
-        <w:trPr>
-          <w:cantSplit/>
-        </w:trPr>
-        <w:tc>
-          <w:tcPr>
-            <w:tcW w:type="dxa" w:w="1930"/>
-            <w:shd w:fill="E8E8E8"/>
-          </w:tcPr>
-          <w:p>
-            <w:pPr>
-              <w:spacing w:before="40" w:after="40" w:lineRule="auto" w:line="240"/>
-            </w:pPr>
-            <w:r>
-              <w:rPr>
-                <w:b/>
-                <w:sz w:val="18"/>
-              </w:rPr>
-              <w:t>Framework (Table 8)</w:t>
-            </w:r>
-          </w:p>
-        </w:tc>
-        <w:tc>
-          <w:tcPr>
-            <w:tcW w:type="dxa" w:w="1930"/>
-            <w:shd w:fill="E8E8E8"/>
-          </w:tcPr>
-          <w:p>
-            <w:pPr>
-              <w:spacing w:before="40" w:after="40" w:lineRule="auto" w:line="240"/>
-            </w:pPr>
-            <w:r>
-              <w:rPr>
-                <w:b/>
-                <w:sz w:val="18"/>
-              </w:rPr>
-              <w:t>Restoration (ms)</w:t>
-            </w:r>
-          </w:p>
-        </w:tc>
-        <w:tc>
-          <w:tcPr>
-            <w:tcW w:type="dxa" w:w="1930"/>
-            <w:shd w:fill="E8E8E8"/>
-          </w:tcPr>
-          <w:p>
-            <w:pPr>
-              <w:spacing w:before="40" w:after="40" w:lineRule="auto" w:line="240"/>
-            </w:pPr>
-            <w:r>
-              <w:rPr>
-                <w:b/>
-                <w:sz w:val="18"/>
-              </w:rPr>
-              <w:t>Seg. (ms)</w:t>
-            </w:r>
-          </w:p>
-        </w:tc>
-        <w:tc>
-          <w:tcPr>
-            <w:tcW w:type="dxa" w:w="1930"/>
-            <w:shd w:fill="E8E8E8"/>
-          </w:tcPr>
-          <w:p>
-            <w:pPr>
-              <w:spacing w:before="40" w:after="40" w:lineRule="auto" w:line="240"/>
-            </w:pPr>
-            <w:r>
-              <w:rPr>
-                <w:b/>
-                <w:sz w:val="18"/>
-              </w:rPr>
-              <w:t>FPS</w:t>
-            </w:r>
-          </w:p>
-        </w:tc>
-        <w:tc>
-          <w:tcPr>
-            <w:tcW w:type="dxa" w:w="1930"/>
-            <w:shd w:fill="E8E8E8"/>
-          </w:tcPr>
-          <w:p>
-            <w:pPr>
-              <w:spacing w:before="40" w:after="40" w:lineRule="auto" w:line="240"/>
-            </w:pPr>
-            <w:r>
-              <w:rPr>
-                <w:b/>
-                <w:sz w:val="18"/>
-              </w:rPr>
-              <w:t>Peak VRAM (MB)</w:t>
-            </w:r>
-          </w:p>
-        </w:tc>
-      </w:tr>
-      <w:tr>
-        <w:trPr>
-          <w:cantSplit/>
-        </w:trPr>
-        <w:tc>
-          <w:tcPr>
-            <w:tcW w:type="dxa" w:w="1930"/>
-          </w:tcPr>
-          <w:p>
-            <w:pPr>
-              <w:spacing w:before="40" w:after="40" w:lineRule="auto" w:line="240"/>
-            </w:pPr>
-            <w:r>
-              <w:rPr>
-                <w:b w:val="0"/>
-                <w:sz w:val="18"/>
-              </w:rPr>
-              <w:t>YOLOv11s + SAM</w:t>
-            </w:r>
-          </w:p>
-        </w:tc>
-        <w:tc>
-          <w:tcPr>
-            <w:tcW w:type="dxa" w:w="1930"/>
-          </w:tcPr>
-          <w:p>
-            <w:pPr>
-              <w:spacing w:before="40" w:after="40" w:lineRule="auto" w:line="240"/>
-            </w:pPr>
-            <w:r>
-              <w:rPr>
-                <w:b w:val="0"/>
-                <w:sz w:val="18"/>
-              </w:rPr>
-              <w:t>5.8</w:t>
-            </w:r>
-          </w:p>
-        </w:tc>
-        <w:tc>
-          <w:tcPr>
-            <w:tcW w:type="dxa" w:w="1930"/>
-          </w:tcPr>
-          <w:p>
-            <w:pPr>
-              <w:spacing w:before="40" w:after="40" w:lineRule="auto" w:line="240"/>
-            </w:pPr>
-            <w:r>
-              <w:rPr>
-                <w:b w:val="0"/>
-                <w:sz w:val="18"/>
-              </w:rPr>
-              <w:t>92.4</w:t>
-            </w:r>
-          </w:p>
-        </w:tc>
-        <w:tc>
-          <w:tcPr>
-            <w:tcW w:type="dxa" w:w="1930"/>
-          </w:tcPr>
-          <w:p>
-            <w:pPr>
-              <w:spacing w:before="40" w:after="40" w:lineRule="auto" w:line="240"/>
-            </w:pPr>
-            <w:r>
-              <w:rPr>
-                <w:b w:val="0"/>
-                <w:sz w:val="18"/>
-              </w:rPr>
-              <w:t>10.2</w:t>
-            </w:r>
-          </w:p>
-        </w:tc>
-        <w:tc>
-          <w:tcPr>
-            <w:tcW w:type="dxa" w:w="1930"/>
-          </w:tcPr>
-          <w:p>
-            <w:pPr>
-              <w:spacing w:before="40" w:after="40" w:lineRule="auto" w:line="240"/>
-            </w:pPr>
-            <w:r>
-              <w:rPr>
-                <w:b w:val="0"/>
-                <w:sz w:val="18"/>
-              </w:rPr>
-              <w:t>6480</w:t>
-            </w:r>
-          </w:p>
-        </w:tc>
-      </w:tr>
-      <w:tr>
-        <w:trPr>
-          <w:cantSplit/>
-        </w:trPr>
-        <w:tc>
-          <w:tcPr>
-            <w:tcW w:type="dxa" w:w="1930"/>
-          </w:tcPr>
-          <w:p>
-            <w:pPr>
-              <w:spacing w:before="40" w:after="40" w:lineRule="auto" w:line="240"/>
-            </w:pPr>
-            <w:r>
-              <w:rPr>
-                <w:b w:val="0"/>
-                <w:sz w:val="18"/>
-              </w:rPr>
-              <w:t>Grounding DINO + SAM</w:t>
-            </w:r>
-          </w:p>
-        </w:tc>
-        <w:tc>
-          <w:tcPr>
-            <w:tcW w:type="dxa" w:w="1930"/>
-          </w:tcPr>
-          <w:p>
-            <w:pPr>
-              <w:spacing w:before="40" w:after="40" w:lineRule="auto" w:line="240"/>
-            </w:pPr>
-            <w:r>
-              <w:rPr>
-                <w:b w:val="0"/>
-                <w:sz w:val="18"/>
-              </w:rPr>
-              <w:t>5.8</w:t>
-            </w:r>
-          </w:p>
-        </w:tc>
-        <w:tc>
-          <w:tcPr>
-            <w:tcW w:type="dxa" w:w="1930"/>
-          </w:tcPr>
-          <w:p>
-            <w:pPr>
-              <w:spacing w:before="40" w:after="40" w:lineRule="auto" w:line="240"/>
-            </w:pPr>
-            <w:r>
-              <w:rPr>
-                <w:b w:val="0"/>
-                <w:sz w:val="18"/>
-              </w:rPr>
-              <w:t>128.2</w:t>
-            </w:r>
-          </w:p>
-        </w:tc>
-        <w:tc>
-          <w:tcPr>
-            <w:tcW w:type="dxa" w:w="1930"/>
-          </w:tcPr>
-          <w:p>
-            <w:pPr>
-              <w:spacing w:before="40" w:after="40" w:lineRule="auto" w:line="240"/>
-            </w:pPr>
-            <w:r>
-              <w:rPr>
-                <w:b w:val="0"/>
-                <w:sz w:val="18"/>
-              </w:rPr>
-              <w:t>7.8</w:t>
-            </w:r>
-          </w:p>
-        </w:tc>
-        <w:tc>
-          <w:tcPr>
-            <w:tcW w:type="dxa" w:w="1930"/>
-          </w:tcPr>
-          <w:p>
-            <w:pPr>
-              <w:spacing w:before="40" w:after="40" w:lineRule="auto" w:line="240"/>
-            </w:pPr>
-            <w:r>
-              <w:rPr>
-                <w:b w:val="0"/>
-                <w:sz w:val="18"/>
-              </w:rPr>
-              <w:t>7920</w:t>
-            </w:r>
-          </w:p>
-        </w:tc>
-      </w:tr>
-      <w:tr>
-        <w:trPr>
-          <w:cantSplit/>
-        </w:trPr>
-        <w:tc>
-          <w:tcPr>
-            <w:tcW w:type="dxa" w:w="1930"/>
-          </w:tcPr>
-          <w:p>
-            <w:pPr>
-              <w:spacing w:before="40" w:after="40" w:lineRule="auto" w:line="240"/>
-            </w:pPr>
-            <w:r>
-              <w:rPr>
-                <w:b/>
-                <w:sz w:val="18"/>
-              </w:rPr>
-              <w:t>Proposed causal pipeline</w:t>
-            </w:r>
-          </w:p>
-        </w:tc>
-        <w:tc>
-          <w:tcPr>
-            <w:tcW w:type="dxa" w:w="1930"/>
-          </w:tcPr>
-          <w:p>
-            <w:pPr>
-              <w:spacing w:before="40" w:after="40" w:lineRule="auto" w:line="240"/>
-            </w:pPr>
-            <w:r>
-              <w:rPr>
-                <w:b/>
-                <w:sz w:val="18"/>
-              </w:rPr>
-              <w:t>5.8</w:t>
-            </w:r>
-          </w:p>
-        </w:tc>
-        <w:tc>
-          <w:tcPr>
-            <w:tcW w:type="dxa" w:w="1930"/>
-          </w:tcPr>
-          <w:p>
-            <w:pPr>
-              <w:spacing w:before="40" w:after="40" w:lineRule="auto" w:line="240"/>
-            </w:pPr>
-            <w:r>
-              <w:rPr>
-                <w:b/>
-                <w:sz w:val="18"/>
-              </w:rPr>
-              <w:t>29.1</w:t>
-            </w:r>
-          </w:p>
-        </w:tc>
-        <w:tc>
-          <w:tcPr>
-            <w:tcW w:type="dxa" w:w="1930"/>
-          </w:tcPr>
-          <w:p>
-            <w:pPr>
-              <w:spacing w:before="40" w:after="40" w:lineRule="auto" w:line="240"/>
-            </w:pPr>
-            <w:r>
-              <w:rPr>
-                <w:b/>
-                <w:sz w:val="18"/>
-              </w:rPr>
-              <w:t>28.6</w:t>
-            </w:r>
-          </w:p>
-        </w:tc>
-        <w:tc>
-          <w:tcPr>
-            <w:tcW w:type="dxa" w:w="1930"/>
-          </w:tcPr>
-          <w:p>
-            <w:pPr>
-              <w:spacing w:before="40" w:after="40" w:lineRule="auto" w:line="240"/>
-            </w:pPr>
-            <w:r>
-              <w:rPr>
-                <w:b/>
-                <w:sz w:val="18"/>
-              </w:rPr>
-              <w:t>4005</w:t>
-            </w:r>
-          </w:p>
-        </w:tc>
-      </w:tr>
-    </w:tbl>
-    <w:p>
-      <w:pPr>
-        <w:spacing w:before="40" w:after="120" w:lineRule="auto" w:line="276"/>
-      </w:pPr>
-      <w:r>
-        <w:rPr>
-          <w:i/>
-          <w:sz w:val="18"/>
-        </w:rPr>
-        <w:t>Embedded efficiency, Jetson AGX Orin FP16 (manuscript Table 5).</w:t>
+        <w:t>State-of-the-art comparison on curated multi-scenario dashcam sequences (manuscript Table 2).</w:t>
       </w:r>
     </w:p>
     <w:sectPr>

</xml_diff>